<commit_message>
parcial de probabilidad 2bach hecho. parcial de algebra 1eso en curso
</commit_message>
<xml_diff>
--- a/matematicas_1ESOA/examenes/parcial_algebra.docx
+++ b/matematicas_1ESOA/examenes/parcial_algebra.docx
@@ -336,10 +336,108 @@
           <w:szCs w:val="24"/>
         </w:rPr>
       </w:pPr>
-      <w:bookmarkStart w:id="0" w:name="_heading=h.u4kex1wm11hh" w:colFirst="0" w:colLast="0"/>
-      <w:bookmarkStart w:id="1" w:name="_heading=h.xvc5ec8xojke" w:colFirst="0" w:colLast="0"/>
-      <w:bookmarkEnd w:id="0"/>
-      <w:bookmarkEnd w:id="1"/>
+      <w:r>
+        <w:rPr>
+          <w:rFonts w:eastAsia="Times New Roman"/>
+          <w:b/>
+          <w:bCs/>
+          <w:i/>
+          <w:iCs/>
+          <w:color w:val="000000"/>
+          <w:sz w:val="24"/>
+          <w:szCs w:val="24"/>
+        </w:rPr>
+        <w:t>[</w:t>
+      </w:r>
+      <w:r>
+        <w:rPr>
+          <w:rFonts w:eastAsia="Times New Roman"/>
+          <w:b/>
+          <w:bCs/>
+          <w:i/>
+          <w:iCs/>
+          <w:color w:val="000000"/>
+          <w:sz w:val="24"/>
+          <w:szCs w:val="24"/>
+        </w:rPr>
+        <w:t>0,</w:t>
+      </w:r>
+      <w:r>
+        <w:rPr>
+          <w:rFonts w:eastAsia="Times New Roman"/>
+          <w:b/>
+          <w:bCs/>
+          <w:i/>
+          <w:iCs/>
+          <w:color w:val="000000"/>
+          <w:sz w:val="24"/>
+          <w:szCs w:val="24"/>
+        </w:rPr>
+        <w:t>7</w:t>
+      </w:r>
+      <w:r>
+        <w:rPr>
+          <w:rFonts w:eastAsia="Times New Roman"/>
+          <w:b/>
+          <w:bCs/>
+          <w:i/>
+          <w:iCs/>
+          <w:color w:val="000000"/>
+          <w:sz w:val="24"/>
+          <w:szCs w:val="24"/>
+        </w:rPr>
+        <w:t>5</w:t>
+      </w:r>
+      <w:r>
+        <w:rPr>
+          <w:rFonts w:eastAsia="Times New Roman"/>
+          <w:b/>
+          <w:bCs/>
+          <w:i/>
+          <w:iCs/>
+          <w:color w:val="000000"/>
+          <w:sz w:val="24"/>
+          <w:szCs w:val="24"/>
+        </w:rPr>
+        <w:t xml:space="preserve"> </w:t>
+      </w:r>
+      <w:proofErr w:type="spellStart"/>
+      <w:r>
+        <w:rPr>
+          <w:rFonts w:eastAsia="Times New Roman"/>
+          <w:b/>
+          <w:bCs/>
+          <w:i/>
+          <w:iCs/>
+          <w:color w:val="000000"/>
+          <w:sz w:val="24"/>
+          <w:szCs w:val="24"/>
+        </w:rPr>
+        <w:t>pts</w:t>
+      </w:r>
+      <w:proofErr w:type="spellEnd"/>
+      <w:r>
+        <w:rPr>
+          <w:rFonts w:eastAsia="Times New Roman"/>
+          <w:b/>
+          <w:bCs/>
+          <w:i/>
+          <w:iCs/>
+          <w:color w:val="000000"/>
+          <w:sz w:val="24"/>
+          <w:szCs w:val="24"/>
+        </w:rPr>
+        <w:t>]</w:t>
+      </w:r>
+      <w:r>
+        <w:rPr>
+          <w:rFonts w:eastAsia="Times New Roman"/>
+          <w:color w:val="000000"/>
+          <w:sz w:val="24"/>
+          <w:szCs w:val="24"/>
+        </w:rPr>
+        <w:t xml:space="preserve"> </w:t>
+      </w:r>
       <w:r>
         <w:rPr>
           <w:rFonts w:eastAsia="Times New Roman"/>
@@ -680,6 +778,108 @@
       <w:r>
         <w:rPr>
           <w:rFonts w:eastAsia="Times New Roman"/>
+          <w:b/>
+          <w:bCs/>
+          <w:i/>
+          <w:iCs/>
+          <w:color w:val="000000"/>
+          <w:sz w:val="24"/>
+          <w:szCs w:val="24"/>
+        </w:rPr>
+        <w:t>[</w:t>
+      </w:r>
+      <w:r>
+        <w:rPr>
+          <w:rFonts w:eastAsia="Times New Roman"/>
+          <w:b/>
+          <w:bCs/>
+          <w:i/>
+          <w:iCs/>
+          <w:color w:val="000000"/>
+          <w:sz w:val="24"/>
+          <w:szCs w:val="24"/>
+        </w:rPr>
+        <w:t>0,</w:t>
+      </w:r>
+      <w:r>
+        <w:rPr>
+          <w:rFonts w:eastAsia="Times New Roman"/>
+          <w:b/>
+          <w:bCs/>
+          <w:i/>
+          <w:iCs/>
+          <w:color w:val="000000"/>
+          <w:sz w:val="24"/>
+          <w:szCs w:val="24"/>
+        </w:rPr>
+        <w:t>7</w:t>
+      </w:r>
+      <w:r>
+        <w:rPr>
+          <w:rFonts w:eastAsia="Times New Roman"/>
+          <w:b/>
+          <w:bCs/>
+          <w:i/>
+          <w:iCs/>
+          <w:color w:val="000000"/>
+          <w:sz w:val="24"/>
+          <w:szCs w:val="24"/>
+        </w:rPr>
+        <w:t>5</w:t>
+      </w:r>
+      <w:r>
+        <w:rPr>
+          <w:rFonts w:eastAsia="Times New Roman"/>
+          <w:b/>
+          <w:bCs/>
+          <w:i/>
+          <w:iCs/>
+          <w:color w:val="000000"/>
+          <w:sz w:val="24"/>
+          <w:szCs w:val="24"/>
+        </w:rPr>
+        <w:t xml:space="preserve"> </w:t>
+      </w:r>
+      <w:proofErr w:type="spellStart"/>
+      <w:r>
+        <w:rPr>
+          <w:rFonts w:eastAsia="Times New Roman"/>
+          <w:b/>
+          <w:bCs/>
+          <w:i/>
+          <w:iCs/>
+          <w:color w:val="000000"/>
+          <w:sz w:val="24"/>
+          <w:szCs w:val="24"/>
+        </w:rPr>
+        <w:t>pts</w:t>
+      </w:r>
+      <w:proofErr w:type="spellEnd"/>
+      <w:r>
+        <w:rPr>
+          <w:rFonts w:eastAsia="Times New Roman"/>
+          <w:b/>
+          <w:bCs/>
+          <w:i/>
+          <w:iCs/>
+          <w:color w:val="000000"/>
+          <w:sz w:val="24"/>
+          <w:szCs w:val="24"/>
+        </w:rPr>
+        <w:t>]</w:t>
+      </w:r>
+      <w:r>
+        <w:rPr>
+          <w:rFonts w:eastAsia="Times New Roman"/>
+          <w:color w:val="000000"/>
+          <w:sz w:val="24"/>
+          <w:szCs w:val="24"/>
+        </w:rPr>
+        <w:t xml:space="preserve"> </w:t>
+      </w:r>
+      <w:r>
+        <w:rPr>
+          <w:rFonts w:eastAsia="Times New Roman"/>
           <w:color w:val="000000"/>
           <w:sz w:val="24"/>
           <w:szCs w:val="24"/>
@@ -1183,6 +1383,82 @@
       <w:r>
         <w:rPr>
           <w:rFonts w:eastAsia="Times New Roman"/>
+          <w:b/>
+          <w:bCs/>
+          <w:i/>
+          <w:iCs/>
+          <w:color w:val="000000"/>
+          <w:sz w:val="24"/>
+          <w:szCs w:val="24"/>
+        </w:rPr>
+        <w:t>[</w:t>
+      </w:r>
+      <w:r>
+        <w:rPr>
+          <w:rFonts w:eastAsia="Times New Roman"/>
+          <w:b/>
+          <w:bCs/>
+          <w:i/>
+          <w:iCs/>
+          <w:color w:val="000000"/>
+          <w:sz w:val="24"/>
+          <w:szCs w:val="24"/>
+        </w:rPr>
+        <w:t>0,5</w:t>
+      </w:r>
+      <w:r>
+        <w:rPr>
+          <w:rFonts w:eastAsia="Times New Roman"/>
+          <w:b/>
+          <w:bCs/>
+          <w:i/>
+          <w:iCs/>
+          <w:color w:val="000000"/>
+          <w:sz w:val="24"/>
+          <w:szCs w:val="24"/>
+        </w:rPr>
+        <w:t xml:space="preserve"> </w:t>
+      </w:r>
+      <w:proofErr w:type="spellStart"/>
+      <w:r>
+        <w:rPr>
+          <w:rFonts w:eastAsia="Times New Roman"/>
+          <w:b/>
+          <w:bCs/>
+          <w:i/>
+          <w:iCs/>
+          <w:color w:val="000000"/>
+          <w:sz w:val="24"/>
+          <w:szCs w:val="24"/>
+        </w:rPr>
+        <w:t>pts</w:t>
+      </w:r>
+      <w:proofErr w:type="spellEnd"/>
+      <w:r>
+        <w:rPr>
+          <w:rFonts w:eastAsia="Times New Roman"/>
+          <w:b/>
+          <w:bCs/>
+          <w:i/>
+          <w:iCs/>
+          <w:color w:val="000000"/>
+          <w:sz w:val="24"/>
+          <w:szCs w:val="24"/>
+        </w:rPr>
+        <w:t>]</w:t>
+      </w:r>
+      <w:r>
+        <w:rPr>
+          <w:rFonts w:eastAsia="Times New Roman"/>
+          <w:color w:val="000000"/>
+          <w:sz w:val="24"/>
+          <w:szCs w:val="24"/>
+        </w:rPr>
+        <w:t xml:space="preserve"> </w:t>
+      </w:r>
+      <w:r>
+        <w:rPr>
+          <w:rFonts w:eastAsia="Times New Roman"/>
           <w:color w:val="000000"/>
           <w:sz w:val="24"/>
           <w:szCs w:val="24"/>
@@ -1459,11 +1735,60 @@
       <w:r>
         <w:rPr>
           <w:rFonts w:eastAsia="Times New Roman"/>
-          <w:color w:val="000000"/>
-          <w:sz w:val="24"/>
-          <w:szCs w:val="24"/>
-        </w:rPr>
-        <w:lastRenderedPageBreak/>
+          <w:b/>
+          <w:bCs/>
+          <w:i/>
+          <w:iCs/>
+          <w:color w:val="000000"/>
+          <w:sz w:val="24"/>
+          <w:szCs w:val="24"/>
+        </w:rPr>
+        <w:t xml:space="preserve">[1 </w:t>
+      </w:r>
+      <w:proofErr w:type="spellStart"/>
+      <w:r>
+        <w:rPr>
+          <w:rFonts w:eastAsia="Times New Roman"/>
+          <w:b/>
+          <w:bCs/>
+          <w:i/>
+          <w:iCs/>
+          <w:color w:val="000000"/>
+          <w:sz w:val="24"/>
+          <w:szCs w:val="24"/>
+        </w:rPr>
+        <w:t>pts</w:t>
+      </w:r>
+      <w:proofErr w:type="spellEnd"/>
+      <w:r>
+        <w:rPr>
+          <w:rFonts w:eastAsia="Times New Roman"/>
+          <w:b/>
+          <w:bCs/>
+          <w:i/>
+          <w:iCs/>
+          <w:color w:val="000000"/>
+          <w:sz w:val="24"/>
+          <w:szCs w:val="24"/>
+        </w:rPr>
+        <w:t>]</w:t>
+      </w:r>
+      <w:r>
+        <w:rPr>
+          <w:rFonts w:eastAsia="Times New Roman"/>
+          <w:color w:val="000000"/>
+          <w:sz w:val="24"/>
+          <w:szCs w:val="24"/>
+        </w:rPr>
+        <w:t xml:space="preserve"> </w:t>
+      </w:r>
+      <w:r>
+        <w:rPr>
+          <w:rFonts w:eastAsia="Times New Roman"/>
+          <w:color w:val="000000"/>
+          <w:sz w:val="24"/>
+          <w:szCs w:val="24"/>
+        </w:rPr>
         <w:t>Rellena los huecos con los tecnicismos matemáticos correspondientes</w:t>
       </w:r>
       <w:r>
@@ -1928,8 +2253,7 @@
           <w:sz w:val="24"/>
           <w:szCs w:val="24"/>
         </w:rPr>
-        <w:lastRenderedPageBreak/>
-        <w:t>Algebra por fin</w:t>
+        <w:t>Representa algebraicamente:</w:t>
       </w:r>
     </w:p>
     <w:p>
@@ -1956,12 +2280,329 @@
       <w:r>
         <w:rPr>
           <w:rFonts w:eastAsia="Times New Roman"/>
-          <w:color w:val="000000"/>
-          <w:sz w:val="24"/>
-          <w:szCs w:val="24"/>
-        </w:rPr>
-        <w:t>Monomio, polinomio, coeficiente y parte literal</w:t>
-      </w:r>
+          <w:b/>
+          <w:bCs/>
+          <w:i/>
+          <w:iCs/>
+          <w:color w:val="000000"/>
+          <w:sz w:val="24"/>
+          <w:szCs w:val="24"/>
+        </w:rPr>
+        <w:t xml:space="preserve">[1 </w:t>
+      </w:r>
+      <w:proofErr w:type="spellStart"/>
+      <w:r>
+        <w:rPr>
+          <w:rFonts w:eastAsia="Times New Roman"/>
+          <w:b/>
+          <w:bCs/>
+          <w:i/>
+          <w:iCs/>
+          <w:color w:val="000000"/>
+          <w:sz w:val="24"/>
+          <w:szCs w:val="24"/>
+        </w:rPr>
+        <w:t>pts</w:t>
+      </w:r>
+      <w:proofErr w:type="spellEnd"/>
+      <w:r>
+        <w:rPr>
+          <w:rFonts w:eastAsia="Times New Roman"/>
+          <w:b/>
+          <w:bCs/>
+          <w:i/>
+          <w:iCs/>
+          <w:color w:val="000000"/>
+          <w:sz w:val="24"/>
+          <w:szCs w:val="24"/>
+        </w:rPr>
+        <w:t>]</w:t>
+      </w:r>
+      <w:r>
+        <w:rPr>
+          <w:rFonts w:eastAsia="Times New Roman"/>
+          <w:color w:val="000000"/>
+          <w:sz w:val="24"/>
+          <w:szCs w:val="24"/>
+        </w:rPr>
+        <w:t xml:space="preserve"> </w:t>
+      </w:r>
+      <w:r>
+        <w:rPr>
+          <w:rFonts w:eastAsia="Times New Roman"/>
+          <w:color w:val="000000"/>
+          <w:sz w:val="24"/>
+          <w:szCs w:val="24"/>
+        </w:rPr>
+        <w:t>Llamemos n a un número cualquiera. Cómo se indica…</w:t>
+      </w:r>
+    </w:p>
+    <w:p>
+      <w:pPr>
+        <w:pBdr>
+          <w:top w:val="nil"/>
+          <w:left w:val="nil"/>
+          <w:bottom w:val="nil"/>
+          <w:right w:val="nil"/>
+          <w:between w:val="nil"/>
+        </w:pBdr>
+        <w:spacing w:after="0" w:line="360" w:lineRule="auto"/>
+        <w:ind w:left="708"/>
+        <w:rPr>
+          <w:rFonts w:eastAsia="Times New Roman"/>
+          <w:color w:val="000000"/>
+          <w:sz w:val="24"/>
+          <w:szCs w:val="24"/>
+        </w:rPr>
+      </w:pPr>
+    </w:p>
+    <w:p>
+      <w:pPr>
+        <w:numPr>
+          <w:ilvl w:val="2"/>
+          <w:numId w:val="4"/>
+        </w:numPr>
+        <w:pBdr>
+          <w:top w:val="nil"/>
+          <w:left w:val="nil"/>
+          <w:bottom w:val="nil"/>
+          <w:right w:val="nil"/>
+          <w:between w:val="nil"/>
+        </w:pBdr>
+        <w:spacing w:after="0" w:line="360" w:lineRule="auto"/>
+        <w:rPr>
+          <w:rFonts w:eastAsia="Times New Roman"/>
+          <w:color w:val="000000"/>
+          <w:sz w:val="24"/>
+          <w:szCs w:val="24"/>
+        </w:rPr>
+      </w:pPr>
+      <w:r>
+        <w:rPr>
+          <w:rFonts w:eastAsia="Times New Roman"/>
+          <w:color w:val="000000"/>
+          <w:sz w:val="24"/>
+          <w:szCs w:val="24"/>
+        </w:rPr>
+        <w:t>¿Su anterior?</w:t>
+      </w:r>
+    </w:p>
+    <w:p>
+      <w:pPr>
+        <w:pBdr>
+          <w:top w:val="nil"/>
+          <w:left w:val="nil"/>
+          <w:bottom w:val="nil"/>
+          <w:right w:val="nil"/>
+          <w:between w:val="nil"/>
+        </w:pBdr>
+        <w:spacing w:after="0" w:line="360" w:lineRule="auto"/>
+        <w:ind w:left="2160"/>
+        <w:rPr>
+          <w:rFonts w:eastAsia="Times New Roman"/>
+          <w:color w:val="000000"/>
+          <w:sz w:val="24"/>
+          <w:szCs w:val="24"/>
+        </w:rPr>
+      </w:pPr>
+    </w:p>
+    <w:p>
+      <w:pPr>
+        <w:numPr>
+          <w:ilvl w:val="2"/>
+          <w:numId w:val="4"/>
+        </w:numPr>
+        <w:pBdr>
+          <w:top w:val="nil"/>
+          <w:left w:val="nil"/>
+          <w:bottom w:val="nil"/>
+          <w:right w:val="nil"/>
+          <w:between w:val="nil"/>
+        </w:pBdr>
+        <w:spacing w:after="0" w:line="360" w:lineRule="auto"/>
+        <w:rPr>
+          <w:rFonts w:eastAsia="Times New Roman"/>
+          <w:color w:val="000000"/>
+          <w:sz w:val="24"/>
+          <w:szCs w:val="24"/>
+        </w:rPr>
+      </w:pPr>
+      <w:r>
+        <w:rPr>
+          <w:rFonts w:eastAsia="Times New Roman"/>
+          <w:color w:val="000000"/>
+          <w:sz w:val="24"/>
+          <w:szCs w:val="24"/>
+        </w:rPr>
+        <w:t>¿Su triple?</w:t>
+      </w:r>
+    </w:p>
+    <w:p>
+      <w:pPr>
+        <w:pBdr>
+          <w:top w:val="nil"/>
+          <w:left w:val="nil"/>
+          <w:bottom w:val="nil"/>
+          <w:right w:val="nil"/>
+          <w:between w:val="nil"/>
+        </w:pBdr>
+        <w:spacing w:after="0" w:line="360" w:lineRule="auto"/>
+        <w:ind w:left="2160"/>
+        <w:rPr>
+          <w:rFonts w:eastAsia="Times New Roman"/>
+          <w:color w:val="000000"/>
+          <w:sz w:val="24"/>
+          <w:szCs w:val="24"/>
+        </w:rPr>
+      </w:pPr>
+    </w:p>
+    <w:p>
+      <w:pPr>
+        <w:numPr>
+          <w:ilvl w:val="2"/>
+          <w:numId w:val="4"/>
+        </w:numPr>
+        <w:pBdr>
+          <w:top w:val="nil"/>
+          <w:left w:val="nil"/>
+          <w:bottom w:val="nil"/>
+          <w:right w:val="nil"/>
+          <w:between w:val="nil"/>
+        </w:pBdr>
+        <w:spacing w:after="0" w:line="360" w:lineRule="auto"/>
+        <w:rPr>
+          <w:rFonts w:eastAsia="Times New Roman"/>
+          <w:color w:val="000000"/>
+          <w:sz w:val="24"/>
+          <w:szCs w:val="24"/>
+        </w:rPr>
+      </w:pPr>
+      <w:r>
+        <w:rPr>
+          <w:rFonts w:eastAsia="Times New Roman"/>
+          <w:color w:val="000000"/>
+          <w:sz w:val="24"/>
+          <w:szCs w:val="24"/>
+        </w:rPr>
+        <w:t>¿Su cuadrado?</w:t>
+      </w:r>
+    </w:p>
+    <w:p>
+      <w:pPr>
+        <w:pBdr>
+          <w:top w:val="nil"/>
+          <w:left w:val="nil"/>
+          <w:bottom w:val="nil"/>
+          <w:right w:val="nil"/>
+          <w:between w:val="nil"/>
+        </w:pBdr>
+        <w:spacing w:after="0" w:line="360" w:lineRule="auto"/>
+        <w:rPr>
+          <w:rFonts w:eastAsia="Times New Roman"/>
+          <w:color w:val="000000"/>
+          <w:sz w:val="24"/>
+          <w:szCs w:val="24"/>
+        </w:rPr>
+      </w:pPr>
+    </w:p>
+    <w:p>
+      <w:pPr>
+        <w:numPr>
+          <w:ilvl w:val="2"/>
+          <w:numId w:val="4"/>
+        </w:numPr>
+        <w:pBdr>
+          <w:top w:val="nil"/>
+          <w:left w:val="nil"/>
+          <w:bottom w:val="nil"/>
+          <w:right w:val="nil"/>
+          <w:between w:val="nil"/>
+        </w:pBdr>
+        <w:spacing w:after="0" w:line="360" w:lineRule="auto"/>
+        <w:rPr>
+          <w:rFonts w:eastAsia="Times New Roman"/>
+          <w:color w:val="000000"/>
+          <w:sz w:val="24"/>
+          <w:szCs w:val="24"/>
+        </w:rPr>
+      </w:pPr>
+      <w:r>
+        <w:rPr>
+          <w:rFonts w:eastAsia="Times New Roman"/>
+          <w:color w:val="000000"/>
+          <w:sz w:val="24"/>
+          <w:szCs w:val="24"/>
+        </w:rPr>
+        <w:t>¿La mitad de su siguiente?</w:t>
+      </w:r>
+    </w:p>
+    <w:p>
+      <w:pPr>
+        <w:pBdr>
+          <w:top w:val="nil"/>
+          <w:left w:val="nil"/>
+          <w:bottom w:val="nil"/>
+          <w:right w:val="nil"/>
+          <w:between w:val="nil"/>
+        </w:pBdr>
+        <w:spacing w:after="0" w:line="360" w:lineRule="auto"/>
+        <w:rPr>
+          <w:rFonts w:eastAsia="Times New Roman"/>
+          <w:color w:val="000000"/>
+          <w:sz w:val="24"/>
+          <w:szCs w:val="24"/>
+        </w:rPr>
+      </w:pPr>
+    </w:p>
+    <w:p>
+      <w:pPr>
+        <w:numPr>
+          <w:ilvl w:val="2"/>
+          <w:numId w:val="4"/>
+        </w:numPr>
+        <w:pBdr>
+          <w:top w:val="nil"/>
+          <w:left w:val="nil"/>
+          <w:bottom w:val="nil"/>
+          <w:right w:val="nil"/>
+          <w:between w:val="nil"/>
+        </w:pBdr>
+        <w:spacing w:after="0" w:line="360" w:lineRule="auto"/>
+        <w:rPr>
+          <w:rFonts w:eastAsia="Times New Roman"/>
+          <w:color w:val="000000"/>
+          <w:sz w:val="24"/>
+          <w:szCs w:val="24"/>
+        </w:rPr>
+      </w:pPr>
+      <w:r>
+        <w:rPr>
+          <w:rFonts w:eastAsia="Times New Roman"/>
+          <w:color w:val="000000"/>
+          <w:sz w:val="24"/>
+          <w:szCs w:val="24"/>
+        </w:rPr>
+        <w:t>¿El siguiente de su mitad?</w:t>
+      </w:r>
+    </w:p>
+    <w:p>
+      <w:pPr>
+        <w:pBdr>
+          <w:top w:val="nil"/>
+          <w:left w:val="nil"/>
+          <w:bottom w:val="nil"/>
+          <w:right w:val="nil"/>
+          <w:between w:val="nil"/>
+        </w:pBdr>
+        <w:spacing w:after="0" w:line="360" w:lineRule="auto"/>
+        <w:ind w:left="2160"/>
+        <w:rPr>
+          <w:rFonts w:eastAsia="Times New Roman"/>
+          <w:color w:val="000000"/>
+          <w:sz w:val="24"/>
+          <w:szCs w:val="24"/>
+        </w:rPr>
+      </w:pPr>
     </w:p>
     <w:p>
       <w:pPr>
@@ -1987,11 +2628,970 @@
       <w:r>
         <w:rPr>
           <w:rFonts w:eastAsia="Times New Roman"/>
-          <w:color w:val="000000"/>
-          <w:sz w:val="24"/>
-          <w:szCs w:val="24"/>
-        </w:rPr>
-        <w:t>Codificar un problema con su expresión algebraica</w:t>
+          <w:b/>
+          <w:bCs/>
+          <w:i/>
+          <w:iCs/>
+          <w:color w:val="000000"/>
+          <w:sz w:val="24"/>
+          <w:szCs w:val="24"/>
+        </w:rPr>
+        <w:t>[</w:t>
+      </w:r>
+      <w:r>
+        <w:rPr>
+          <w:rFonts w:eastAsia="Times New Roman"/>
+          <w:b/>
+          <w:bCs/>
+          <w:i/>
+          <w:iCs/>
+          <w:color w:val="000000"/>
+          <w:sz w:val="24"/>
+          <w:szCs w:val="24"/>
+        </w:rPr>
+        <w:t>0,5</w:t>
+      </w:r>
+      <w:r>
+        <w:rPr>
+          <w:rFonts w:eastAsia="Times New Roman"/>
+          <w:b/>
+          <w:bCs/>
+          <w:i/>
+          <w:iCs/>
+          <w:color w:val="000000"/>
+          <w:sz w:val="24"/>
+          <w:szCs w:val="24"/>
+        </w:rPr>
+        <w:t xml:space="preserve"> </w:t>
+      </w:r>
+      <w:proofErr w:type="spellStart"/>
+      <w:r>
+        <w:rPr>
+          <w:rFonts w:eastAsia="Times New Roman"/>
+          <w:b/>
+          <w:bCs/>
+          <w:i/>
+          <w:iCs/>
+          <w:color w:val="000000"/>
+          <w:sz w:val="24"/>
+          <w:szCs w:val="24"/>
+        </w:rPr>
+        <w:t>pts</w:t>
+      </w:r>
+      <w:proofErr w:type="spellEnd"/>
+      <w:r>
+        <w:rPr>
+          <w:rFonts w:eastAsia="Times New Roman"/>
+          <w:b/>
+          <w:bCs/>
+          <w:i/>
+          <w:iCs/>
+          <w:color w:val="000000"/>
+          <w:sz w:val="24"/>
+          <w:szCs w:val="24"/>
+        </w:rPr>
+        <w:t>]</w:t>
+      </w:r>
+      <w:r>
+        <w:rPr>
+          <w:rFonts w:eastAsia="Times New Roman"/>
+          <w:color w:val="000000"/>
+          <w:sz w:val="24"/>
+          <w:szCs w:val="24"/>
+        </w:rPr>
+        <w:t xml:space="preserve"> </w:t>
+      </w:r>
+      <w:r>
+        <w:rPr>
+          <w:rFonts w:eastAsia="Times New Roman"/>
+          <w:color w:val="000000"/>
+          <w:sz w:val="24"/>
+          <w:szCs w:val="24"/>
+        </w:rPr>
+        <w:t xml:space="preserve">El sueldo de mi </w:t>
+      </w:r>
+      <w:r>
+        <w:rPr>
+          <w:rFonts w:eastAsia="Times New Roman"/>
+          <w:color w:val="000000"/>
+          <w:sz w:val="24"/>
+          <w:szCs w:val="24"/>
+        </w:rPr>
+        <w:t xml:space="preserve">hermano es el doble del mío. Entre los dos, ganamos 200 euros al mes menos que mi madre. ¿Si llamamos </w:t>
+      </w:r>
+      <w:r>
+        <w:rPr>
+          <w:rFonts w:eastAsia="Times New Roman"/>
+          <w:b/>
+          <w:bCs/>
+          <w:color w:val="000000"/>
+          <w:sz w:val="24"/>
+          <w:szCs w:val="24"/>
+        </w:rPr>
+        <w:t>x</w:t>
+      </w:r>
+      <w:r>
+        <w:rPr>
+          <w:rFonts w:eastAsia="Times New Roman"/>
+          <w:color w:val="000000"/>
+          <w:sz w:val="24"/>
+          <w:szCs w:val="24"/>
+        </w:rPr>
+        <w:t xml:space="preserve"> a mi sueldo e </w:t>
+      </w:r>
+      <w:r>
+        <w:rPr>
+          <w:rFonts w:eastAsia="Times New Roman"/>
+          <w:b/>
+          <w:bCs/>
+          <w:color w:val="000000"/>
+          <w:sz w:val="24"/>
+          <w:szCs w:val="24"/>
+        </w:rPr>
+        <w:t>y</w:t>
+      </w:r>
+      <w:r>
+        <w:rPr>
+          <w:rFonts w:eastAsia="Times New Roman"/>
+          <w:color w:val="000000"/>
+          <w:sz w:val="24"/>
+          <w:szCs w:val="24"/>
+        </w:rPr>
+        <w:t xml:space="preserve"> al de mi madre, qué ecuación representa esta afirmación?</w:t>
+      </w:r>
+      <w:r>
+        <w:rPr>
+          <w:rFonts w:eastAsia="Times New Roman"/>
+          <w:color w:val="000000"/>
+          <w:sz w:val="24"/>
+          <w:szCs w:val="24"/>
+        </w:rPr>
+        <w:t xml:space="preserve"> </w:t>
+      </w:r>
+    </w:p>
+    <w:p>
+      <w:pPr>
+        <w:pBdr>
+          <w:top w:val="nil"/>
+          <w:left w:val="nil"/>
+          <w:bottom w:val="nil"/>
+          <w:right w:val="nil"/>
+          <w:between w:val="nil"/>
+        </w:pBdr>
+        <w:spacing w:after="0" w:line="360" w:lineRule="auto"/>
+        <w:ind w:left="708"/>
+        <w:rPr>
+          <w:rFonts w:eastAsia="Times New Roman"/>
+          <w:color w:val="000000"/>
+          <w:sz w:val="24"/>
+          <w:szCs w:val="24"/>
+        </w:rPr>
+      </w:pPr>
+    </w:p>
+    <w:p>
+      <w:pPr>
+        <w:pBdr>
+          <w:top w:val="nil"/>
+          <w:left w:val="nil"/>
+          <w:bottom w:val="nil"/>
+          <w:right w:val="nil"/>
+          <w:between w:val="nil"/>
+        </w:pBdr>
+        <w:spacing w:after="0" w:line="360" w:lineRule="auto"/>
+        <w:ind w:left="708"/>
+        <w:rPr>
+          <w:rFonts w:eastAsia="Times New Roman"/>
+          <w:color w:val="000000"/>
+          <w:sz w:val="24"/>
+          <w:szCs w:val="24"/>
+        </w:rPr>
+      </w:pPr>
+    </w:p>
+    <w:p>
+      <w:pPr>
+        <w:pBdr>
+          <w:top w:val="nil"/>
+          <w:left w:val="nil"/>
+          <w:bottom w:val="nil"/>
+          <w:right w:val="nil"/>
+          <w:between w:val="nil"/>
+        </w:pBdr>
+        <w:spacing w:after="0" w:line="360" w:lineRule="auto"/>
+        <w:ind w:left="708"/>
+        <w:rPr>
+          <w:rFonts w:eastAsia="Times New Roman"/>
+          <w:color w:val="000000"/>
+          <w:sz w:val="24"/>
+          <w:szCs w:val="24"/>
+        </w:rPr>
+      </w:pPr>
+    </w:p>
+    <w:p>
+      <w:pPr>
+        <w:pBdr>
+          <w:top w:val="nil"/>
+          <w:left w:val="nil"/>
+          <w:bottom w:val="nil"/>
+          <w:right w:val="nil"/>
+          <w:between w:val="nil"/>
+        </w:pBdr>
+        <w:spacing w:after="0" w:line="360" w:lineRule="auto"/>
+        <w:ind w:left="708"/>
+        <w:rPr>
+          <w:rFonts w:eastAsia="Times New Roman"/>
+          <w:color w:val="000000"/>
+          <w:sz w:val="24"/>
+          <w:szCs w:val="24"/>
+        </w:rPr>
+      </w:pPr>
+    </w:p>
+    <w:p>
+      <w:pPr>
+        <w:pBdr>
+          <w:top w:val="nil"/>
+          <w:left w:val="nil"/>
+          <w:bottom w:val="nil"/>
+          <w:right w:val="nil"/>
+          <w:between w:val="nil"/>
+        </w:pBdr>
+        <w:spacing w:after="0" w:line="360" w:lineRule="auto"/>
+        <w:ind w:left="708"/>
+        <w:rPr>
+          <w:rFonts w:eastAsia="Times New Roman"/>
+          <w:color w:val="000000"/>
+          <w:sz w:val="24"/>
+          <w:szCs w:val="24"/>
+        </w:rPr>
+      </w:pPr>
+    </w:p>
+    <w:p>
+      <w:pPr>
+        <w:numPr>
+          <w:ilvl w:val="0"/>
+          <w:numId w:val="4"/>
+        </w:numPr>
+        <w:pBdr>
+          <w:top w:val="nil"/>
+          <w:left w:val="nil"/>
+          <w:bottom w:val="nil"/>
+          <w:right w:val="nil"/>
+          <w:between w:val="nil"/>
+        </w:pBdr>
+        <w:spacing w:after="0" w:line="360" w:lineRule="auto"/>
+        <w:rPr>
+          <w:rFonts w:eastAsia="Times New Roman"/>
+          <w:color w:val="000000"/>
+          <w:sz w:val="24"/>
+          <w:szCs w:val="24"/>
+        </w:rPr>
+      </w:pPr>
+      <w:r>
+        <w:rPr>
+          <w:rFonts w:eastAsia="Times New Roman"/>
+          <w:b/>
+          <w:bCs/>
+          <w:i/>
+          <w:iCs/>
+          <w:color w:val="000000"/>
+          <w:sz w:val="24"/>
+          <w:szCs w:val="24"/>
+        </w:rPr>
+        <w:t>[</w:t>
+      </w:r>
+      <w:r>
+        <w:rPr>
+          <w:rFonts w:eastAsia="Times New Roman"/>
+          <w:b/>
+          <w:bCs/>
+          <w:i/>
+          <w:iCs/>
+          <w:color w:val="000000"/>
+          <w:sz w:val="24"/>
+          <w:szCs w:val="24"/>
+        </w:rPr>
+        <w:t>0,5</w:t>
+      </w:r>
+      <w:r>
+        <w:rPr>
+          <w:rFonts w:eastAsia="Times New Roman"/>
+          <w:b/>
+          <w:bCs/>
+          <w:i/>
+          <w:iCs/>
+          <w:color w:val="000000"/>
+          <w:sz w:val="24"/>
+          <w:szCs w:val="24"/>
+        </w:rPr>
+        <w:t xml:space="preserve"> </w:t>
+      </w:r>
+      <w:proofErr w:type="spellStart"/>
+      <w:r>
+        <w:rPr>
+          <w:rFonts w:eastAsia="Times New Roman"/>
+          <w:b/>
+          <w:bCs/>
+          <w:i/>
+          <w:iCs/>
+          <w:color w:val="000000"/>
+          <w:sz w:val="24"/>
+          <w:szCs w:val="24"/>
+        </w:rPr>
+        <w:t>pts</w:t>
+      </w:r>
+      <w:proofErr w:type="spellEnd"/>
+      <w:r>
+        <w:rPr>
+          <w:rFonts w:eastAsia="Times New Roman"/>
+          <w:b/>
+          <w:bCs/>
+          <w:i/>
+          <w:iCs/>
+          <w:color w:val="000000"/>
+          <w:sz w:val="24"/>
+          <w:szCs w:val="24"/>
+        </w:rPr>
+        <w:t>]</w:t>
+      </w:r>
+      <w:r>
+        <w:rPr>
+          <w:rFonts w:eastAsia="Times New Roman"/>
+          <w:color w:val="000000"/>
+          <w:sz w:val="24"/>
+          <w:szCs w:val="24"/>
+        </w:rPr>
+        <w:t xml:space="preserve"> </w:t>
+      </w:r>
+      <w:r>
+        <w:rPr>
+          <w:rFonts w:eastAsia="Times New Roman"/>
+          <w:color w:val="000000"/>
+          <w:sz w:val="24"/>
+          <w:szCs w:val="24"/>
+        </w:rPr>
+        <w:t>En este polinomio</w:t>
+      </w:r>
+      <w:r>
+        <w:rPr>
+          <w:rFonts w:eastAsia="Times New Roman"/>
+          <w:color w:val="000000"/>
+          <w:sz w:val="24"/>
+          <w:szCs w:val="24"/>
+        </w:rPr>
+        <w:t xml:space="preserve">, </w:t>
+      </w:r>
+      <w:r>
+        <w:rPr>
+          <w:rFonts w:eastAsia="Times New Roman"/>
+          <w:b/>
+          <w:bCs/>
+          <w:color w:val="000000"/>
+          <w:sz w:val="24"/>
+          <w:szCs w:val="24"/>
+          <w:u w:val="single"/>
+        </w:rPr>
+        <w:t>subraya</w:t>
+      </w:r>
+      <w:r>
+        <w:rPr>
+          <w:rFonts w:eastAsia="Times New Roman"/>
+          <w:color w:val="000000"/>
+          <w:sz w:val="24"/>
+          <w:szCs w:val="24"/>
+        </w:rPr>
+        <w:t xml:space="preserve"> todas las </w:t>
+      </w:r>
+      <w:r>
+        <w:rPr>
+          <w:rFonts w:eastAsia="Times New Roman"/>
+          <w:b/>
+          <w:bCs/>
+          <w:color w:val="000000"/>
+          <w:sz w:val="24"/>
+          <w:szCs w:val="24"/>
+        </w:rPr>
+        <w:t>partes</w:t>
+      </w:r>
+      <w:r>
+        <w:rPr>
+          <w:rFonts w:eastAsia="Times New Roman"/>
+          <w:color w:val="000000"/>
+          <w:sz w:val="24"/>
+          <w:szCs w:val="24"/>
+        </w:rPr>
+        <w:t xml:space="preserve"> </w:t>
+      </w:r>
+      <w:r>
+        <w:rPr>
+          <w:rFonts w:eastAsia="Times New Roman"/>
+          <w:b/>
+          <w:bCs/>
+          <w:color w:val="000000"/>
+          <w:sz w:val="24"/>
+          <w:szCs w:val="24"/>
+        </w:rPr>
+        <w:t>literales</w:t>
+      </w:r>
+      <w:r>
+        <w:rPr>
+          <w:rFonts w:eastAsia="Times New Roman"/>
+          <w:color w:val="000000"/>
+          <w:sz w:val="24"/>
+          <w:szCs w:val="24"/>
+        </w:rPr>
+        <w:t xml:space="preserve"> y </w:t>
+      </w:r>
+      <w:r>
+        <w:rPr>
+          <w:rFonts w:eastAsia="Times New Roman"/>
+          <w:b/>
+          <w:bCs/>
+          <w:i/>
+          <w:iCs/>
+          <w:color w:val="000000"/>
+          <w:sz w:val="24"/>
+          <w:szCs w:val="24"/>
+        </w:rPr>
+        <w:t>rodea</w:t>
+      </w:r>
+      <w:r>
+        <w:rPr>
+          <w:rFonts w:eastAsia="Times New Roman"/>
+          <w:color w:val="000000"/>
+          <w:sz w:val="24"/>
+          <w:szCs w:val="24"/>
+        </w:rPr>
+        <w:t xml:space="preserve"> todos los </w:t>
+      </w:r>
+      <w:r>
+        <w:rPr>
+          <w:rFonts w:eastAsia="Times New Roman"/>
+          <w:b/>
+          <w:bCs/>
+          <w:color w:val="000000"/>
+          <w:sz w:val="24"/>
+          <w:szCs w:val="24"/>
+        </w:rPr>
+        <w:t>coeficientes</w:t>
+      </w:r>
+      <w:r>
+        <w:rPr>
+          <w:rFonts w:eastAsia="Times New Roman"/>
+          <w:color w:val="000000"/>
+          <w:sz w:val="24"/>
+          <w:szCs w:val="24"/>
+        </w:rPr>
+        <w:t>.</w:t>
+      </w:r>
+    </w:p>
+    <w:p>
+      <w:pPr>
+        <w:pStyle w:val="ListParagraph"/>
+        <w:rPr>
+          <w:rFonts w:eastAsia="Times New Roman"/>
+          <w:color w:val="000000"/>
+          <w:sz w:val="24"/>
+          <w:szCs w:val="24"/>
+        </w:rPr>
+      </w:pPr>
+    </w:p>
+    <w:p>
+      <w:pPr>
+        <w:pBdr>
+          <w:top w:val="nil"/>
+          <w:left w:val="nil"/>
+          <w:bottom w:val="nil"/>
+          <w:right w:val="nil"/>
+          <w:between w:val="nil"/>
+        </w:pBdr>
+        <w:spacing w:after="0" w:line="360" w:lineRule="auto"/>
+        <w:ind w:left="708"/>
+        <w:jc w:val="center"/>
+        <w:rPr>
+          <w:rFonts w:eastAsia="Times New Roman"/>
+          <w:color w:val="000000"/>
+          <w:sz w:val="32"/>
+          <w:szCs w:val="32"/>
+        </w:rPr>
+      </w:pPr>
+      <w:r>
+        <w:rPr>
+          <w:rFonts w:eastAsia="Times New Roman"/>
+          <w:color w:val="000000"/>
+          <w:sz w:val="32"/>
+          <w:szCs w:val="32"/>
+        </w:rPr>
+        <w:t>3x</w:t>
+      </w:r>
+      <w:r>
+        <w:rPr>
+          <w:rFonts w:eastAsia="Times New Roman"/>
+          <w:color w:val="000000"/>
+          <w:sz w:val="32"/>
+          <w:szCs w:val="32"/>
+          <w:vertAlign w:val="superscript"/>
+        </w:rPr>
+        <w:t>2</w:t>
+      </w:r>
+      <w:r>
+        <w:rPr>
+          <w:rFonts w:eastAsia="Times New Roman"/>
+          <w:color w:val="000000"/>
+          <w:sz w:val="32"/>
+          <w:szCs w:val="32"/>
+        </w:rPr>
+        <w:t xml:space="preserve"> +5xy – 0,1y</w:t>
+      </w:r>
+    </w:p>
+    <w:p>
+      <w:pPr>
+        <w:pBdr>
+          <w:top w:val="nil"/>
+          <w:left w:val="nil"/>
+          <w:bottom w:val="nil"/>
+          <w:right w:val="nil"/>
+          <w:between w:val="nil"/>
+        </w:pBdr>
+        <w:spacing w:after="0" w:line="360" w:lineRule="auto"/>
+        <w:ind w:left="708"/>
+        <w:rPr>
+          <w:rFonts w:eastAsia="Times New Roman"/>
+          <w:color w:val="000000"/>
+          <w:sz w:val="24"/>
+          <w:szCs w:val="24"/>
+        </w:rPr>
+      </w:pPr>
+    </w:p>
+    <w:p>
+      <w:pPr>
+        <w:numPr>
+          <w:ilvl w:val="0"/>
+          <w:numId w:val="4"/>
+        </w:numPr>
+        <w:pBdr>
+          <w:top w:val="nil"/>
+          <w:left w:val="nil"/>
+          <w:bottom w:val="nil"/>
+          <w:right w:val="nil"/>
+          <w:between w:val="nil"/>
+        </w:pBdr>
+        <w:spacing w:after="0" w:line="360" w:lineRule="auto"/>
+        <w:rPr>
+          <w:rFonts w:eastAsia="Times New Roman"/>
+          <w:color w:val="000000"/>
+          <w:sz w:val="24"/>
+          <w:szCs w:val="24"/>
+        </w:rPr>
+      </w:pPr>
+      <w:r>
+        <w:rPr>
+          <w:rFonts w:eastAsia="Times New Roman"/>
+          <w:b/>
+          <w:bCs/>
+          <w:i/>
+          <w:iCs/>
+          <w:color w:val="000000"/>
+          <w:sz w:val="24"/>
+          <w:szCs w:val="24"/>
+        </w:rPr>
+        <w:t>[</w:t>
+      </w:r>
+      <w:r>
+        <w:rPr>
+          <w:rFonts w:eastAsia="Times New Roman"/>
+          <w:b/>
+          <w:bCs/>
+          <w:i/>
+          <w:iCs/>
+          <w:color w:val="000000"/>
+          <w:sz w:val="24"/>
+          <w:szCs w:val="24"/>
+        </w:rPr>
+        <w:t>1</w:t>
+      </w:r>
+      <w:r>
+        <w:rPr>
+          <w:rFonts w:eastAsia="Times New Roman"/>
+          <w:b/>
+          <w:bCs/>
+          <w:i/>
+          <w:iCs/>
+          <w:color w:val="000000"/>
+          <w:sz w:val="24"/>
+          <w:szCs w:val="24"/>
+        </w:rPr>
+        <w:t xml:space="preserve"> </w:t>
+      </w:r>
+      <w:proofErr w:type="spellStart"/>
+      <w:r>
+        <w:rPr>
+          <w:rFonts w:eastAsia="Times New Roman"/>
+          <w:b/>
+          <w:bCs/>
+          <w:i/>
+          <w:iCs/>
+          <w:color w:val="000000"/>
+          <w:sz w:val="24"/>
+          <w:szCs w:val="24"/>
+        </w:rPr>
+        <w:t>pts</w:t>
+      </w:r>
+      <w:proofErr w:type="spellEnd"/>
+      <w:r>
+        <w:rPr>
+          <w:rFonts w:eastAsia="Times New Roman"/>
+          <w:b/>
+          <w:bCs/>
+          <w:i/>
+          <w:iCs/>
+          <w:color w:val="000000"/>
+          <w:sz w:val="24"/>
+          <w:szCs w:val="24"/>
+        </w:rPr>
+        <w:t>]</w:t>
+      </w:r>
+      <w:r>
+        <w:rPr>
+          <w:rFonts w:eastAsia="Times New Roman"/>
+          <w:b/>
+          <w:bCs/>
+          <w:i/>
+          <w:iCs/>
+          <w:color w:val="000000"/>
+          <w:sz w:val="24"/>
+          <w:szCs w:val="24"/>
+        </w:rPr>
+        <w:t xml:space="preserve"> </w:t>
+      </w:r>
+      <w:r>
+        <w:rPr>
+          <w:rFonts w:eastAsia="Times New Roman"/>
+          <w:color w:val="000000"/>
+          <w:sz w:val="24"/>
+          <w:szCs w:val="24"/>
+        </w:rPr>
+        <w:t xml:space="preserve">¿Cómo se consigue un mayor valor numérico en la </w:t>
+      </w:r>
+      <w:r>
+        <w:rPr>
+          <w:rFonts w:eastAsia="Times New Roman"/>
+          <w:color w:val="000000"/>
+          <w:sz w:val="24"/>
+          <w:szCs w:val="24"/>
+        </w:rPr>
+        <w:t xml:space="preserve">siguiente </w:t>
+      </w:r>
+      <w:r>
+        <w:rPr>
+          <w:rFonts w:eastAsia="Times New Roman"/>
+          <w:color w:val="000000"/>
+          <w:sz w:val="24"/>
+          <w:szCs w:val="24"/>
+        </w:rPr>
+        <w:t>expresión algebraica, con x = 0 o con x = 1?</w:t>
+      </w:r>
+      <w:r>
+        <w:rPr>
+          <w:rFonts w:eastAsia="Times New Roman"/>
+          <w:color w:val="000000"/>
+          <w:sz w:val="24"/>
+          <w:szCs w:val="24"/>
+        </w:rPr>
+        <w:t xml:space="preserve"> </w:t>
+      </w:r>
+    </w:p>
+    <w:p>
+      <w:pPr>
+        <w:pBdr>
+          <w:top w:val="nil"/>
+          <w:left w:val="nil"/>
+          <w:bottom w:val="nil"/>
+          <w:right w:val="nil"/>
+          <w:between w:val="nil"/>
+        </w:pBdr>
+        <w:spacing w:after="0" w:line="360" w:lineRule="auto"/>
+        <w:ind w:left="720"/>
+        <w:rPr>
+          <w:rFonts w:eastAsia="Times New Roman"/>
+          <w:color w:val="000000"/>
+          <w:sz w:val="24"/>
+          <w:szCs w:val="24"/>
+        </w:rPr>
+      </w:pPr>
+    </w:p>
+    <w:p>
+      <w:pPr>
+        <w:pBdr>
+          <w:top w:val="nil"/>
+          <w:left w:val="nil"/>
+          <w:bottom w:val="nil"/>
+          <w:right w:val="nil"/>
+          <w:between w:val="nil"/>
+        </w:pBdr>
+        <w:spacing w:after="0" w:line="360" w:lineRule="auto"/>
+        <w:ind w:left="720"/>
+        <w:jc w:val="center"/>
+        <w:rPr>
+          <w:rFonts w:eastAsia="Times New Roman"/>
+          <w:color w:val="000000"/>
+          <w:sz w:val="32"/>
+          <w:szCs w:val="32"/>
+        </w:rPr>
+      </w:pPr>
+      <w:r>
+        <w:rPr>
+          <w:rFonts w:eastAsia="Times New Roman"/>
+          <w:color w:val="000000"/>
+          <w:sz w:val="32"/>
+          <w:szCs w:val="32"/>
+        </w:rPr>
+        <w:t>x</w:t>
+      </w:r>
+      <w:r>
+        <w:rPr>
+          <w:rFonts w:eastAsia="Times New Roman"/>
+          <w:color w:val="000000"/>
+          <w:sz w:val="32"/>
+          <w:szCs w:val="32"/>
+          <w:vertAlign w:val="superscript"/>
+        </w:rPr>
+        <w:t>2</w:t>
+      </w:r>
+      <w:r>
+        <w:rPr>
+          <w:rFonts w:eastAsia="Times New Roman"/>
+          <w:color w:val="000000"/>
+          <w:sz w:val="32"/>
+          <w:szCs w:val="32"/>
+        </w:rPr>
+        <w:t xml:space="preserve"> – 2x + 3</w:t>
+      </w:r>
+    </w:p>
+    <w:p>
+      <w:pPr>
+        <w:pBdr>
+          <w:top w:val="nil"/>
+          <w:left w:val="nil"/>
+          <w:bottom w:val="nil"/>
+          <w:right w:val="nil"/>
+          <w:between w:val="nil"/>
+        </w:pBdr>
+        <w:spacing w:after="0" w:line="360" w:lineRule="auto"/>
+        <w:ind w:left="708"/>
+        <w:rPr>
+          <w:rFonts w:eastAsia="Times New Roman"/>
+          <w:color w:val="000000"/>
+          <w:sz w:val="24"/>
+          <w:szCs w:val="24"/>
+        </w:rPr>
+      </w:pPr>
+    </w:p>
+    <w:p>
+      <w:pPr>
+        <w:pBdr>
+          <w:top w:val="nil"/>
+          <w:left w:val="nil"/>
+          <w:bottom w:val="nil"/>
+          <w:right w:val="nil"/>
+          <w:between w:val="nil"/>
+        </w:pBdr>
+        <w:spacing w:after="0" w:line="360" w:lineRule="auto"/>
+        <w:ind w:left="708"/>
+        <w:rPr>
+          <w:rFonts w:eastAsia="Times New Roman"/>
+          <w:color w:val="000000"/>
+          <w:sz w:val="24"/>
+          <w:szCs w:val="24"/>
+        </w:rPr>
+      </w:pPr>
+    </w:p>
+    <w:p>
+      <w:pPr>
+        <w:pBdr>
+          <w:top w:val="nil"/>
+          <w:left w:val="nil"/>
+          <w:bottom w:val="nil"/>
+          <w:right w:val="nil"/>
+          <w:between w:val="nil"/>
+        </w:pBdr>
+        <w:spacing w:after="0" w:line="360" w:lineRule="auto"/>
+        <w:ind w:left="708"/>
+        <w:rPr>
+          <w:rFonts w:eastAsia="Times New Roman"/>
+          <w:color w:val="000000"/>
+          <w:sz w:val="24"/>
+          <w:szCs w:val="24"/>
+        </w:rPr>
+      </w:pPr>
+    </w:p>
+    <w:p>
+      <w:pPr>
+        <w:pBdr>
+          <w:top w:val="nil"/>
+          <w:left w:val="nil"/>
+          <w:bottom w:val="nil"/>
+          <w:right w:val="nil"/>
+          <w:between w:val="nil"/>
+        </w:pBdr>
+        <w:spacing w:after="0" w:line="360" w:lineRule="auto"/>
+        <w:ind w:left="708"/>
+        <w:rPr>
+          <w:rFonts w:eastAsia="Times New Roman"/>
+          <w:color w:val="000000"/>
+          <w:sz w:val="24"/>
+          <w:szCs w:val="24"/>
+        </w:rPr>
+      </w:pPr>
+    </w:p>
+    <w:p>
+      <w:pPr>
+        <w:numPr>
+          <w:ilvl w:val="0"/>
+          <w:numId w:val="4"/>
+        </w:numPr>
+        <w:pBdr>
+          <w:top w:val="nil"/>
+          <w:left w:val="nil"/>
+          <w:bottom w:val="nil"/>
+          <w:right w:val="nil"/>
+          <w:between w:val="nil"/>
+        </w:pBdr>
+        <w:spacing w:after="0" w:line="360" w:lineRule="auto"/>
+        <w:rPr>
+          <w:rFonts w:eastAsia="Times New Roman"/>
+          <w:color w:val="000000"/>
+          <w:sz w:val="24"/>
+          <w:szCs w:val="24"/>
+        </w:rPr>
+      </w:pPr>
+      <w:r>
+        <w:rPr>
+          <w:rFonts w:eastAsia="Times New Roman"/>
+          <w:b/>
+          <w:bCs/>
+          <w:i/>
+          <w:iCs/>
+          <w:color w:val="000000"/>
+          <w:sz w:val="24"/>
+          <w:szCs w:val="24"/>
+        </w:rPr>
+        <w:t>[</w:t>
+      </w:r>
+      <w:r>
+        <w:rPr>
+          <w:rFonts w:eastAsia="Times New Roman"/>
+          <w:b/>
+          <w:bCs/>
+          <w:i/>
+          <w:iCs/>
+          <w:color w:val="000000"/>
+          <w:sz w:val="24"/>
+          <w:szCs w:val="24"/>
+        </w:rPr>
+        <w:t>1</w:t>
+      </w:r>
+      <w:r>
+        <w:rPr>
+          <w:rFonts w:eastAsia="Times New Roman"/>
+          <w:b/>
+          <w:bCs/>
+          <w:i/>
+          <w:iCs/>
+          <w:color w:val="000000"/>
+          <w:sz w:val="24"/>
+          <w:szCs w:val="24"/>
+        </w:rPr>
+        <w:t xml:space="preserve"> </w:t>
+      </w:r>
+      <w:proofErr w:type="spellStart"/>
+      <w:r>
+        <w:rPr>
+          <w:rFonts w:eastAsia="Times New Roman"/>
+          <w:b/>
+          <w:bCs/>
+          <w:i/>
+          <w:iCs/>
+          <w:color w:val="000000"/>
+          <w:sz w:val="24"/>
+          <w:szCs w:val="24"/>
+        </w:rPr>
+        <w:t>pts</w:t>
+      </w:r>
+      <w:proofErr w:type="spellEnd"/>
+      <w:r>
+        <w:rPr>
+          <w:rFonts w:eastAsia="Times New Roman"/>
+          <w:b/>
+          <w:bCs/>
+          <w:i/>
+          <w:iCs/>
+          <w:color w:val="000000"/>
+          <w:sz w:val="24"/>
+          <w:szCs w:val="24"/>
+        </w:rPr>
+        <w:t>]</w:t>
+      </w:r>
+      <w:r>
+        <w:rPr>
+          <w:rFonts w:eastAsia="Times New Roman"/>
+          <w:color w:val="000000"/>
+          <w:sz w:val="24"/>
+          <w:szCs w:val="24"/>
+        </w:rPr>
+        <w:t xml:space="preserve"> </w:t>
+      </w:r>
+      <w:r>
+        <w:rPr>
+          <w:rFonts w:eastAsia="Times New Roman"/>
+          <w:color w:val="000000"/>
+          <w:sz w:val="24"/>
+          <w:szCs w:val="24"/>
+        </w:rPr>
+        <w:t>Op</w:t>
+      </w:r>
+      <w:r>
+        <w:rPr>
+          <w:rFonts w:eastAsia="Times New Roman"/>
+          <w:color w:val="000000"/>
+          <w:sz w:val="24"/>
+          <w:szCs w:val="24"/>
+        </w:rPr>
+        <w:t>eracione</w:t>
+      </w:r>
+      <w:r>
+        <w:rPr>
+          <w:rFonts w:eastAsia="Times New Roman"/>
+          <w:color w:val="000000"/>
+          <w:sz w:val="24"/>
+          <w:szCs w:val="24"/>
+        </w:rPr>
+        <w:t xml:space="preserve">s </w:t>
+      </w:r>
+      <w:r>
+        <w:rPr>
+          <w:rFonts w:eastAsia="Times New Roman"/>
+          <w:color w:val="000000"/>
+          <w:sz w:val="24"/>
+          <w:szCs w:val="24"/>
+        </w:rPr>
+        <w:t>varias</w:t>
+      </w:r>
+      <w:r>
+        <w:rPr>
+          <w:rFonts w:eastAsia="Times New Roman"/>
+          <w:color w:val="000000"/>
+          <w:sz w:val="24"/>
+          <w:szCs w:val="24"/>
+        </w:rPr>
+        <w:t xml:space="preserve"> con monomios</w:t>
+      </w:r>
+      <w:r>
+        <w:rPr>
+          <w:rFonts w:eastAsia="Times New Roman"/>
+          <w:color w:val="000000"/>
+          <w:sz w:val="24"/>
+          <w:szCs w:val="24"/>
+        </w:rPr>
+        <w:t>:</w:t>
       </w:r>
     </w:p>
     <w:p>
@@ -2022,27 +3622,54 @@
           <w:sz w:val="24"/>
           <w:szCs w:val="24"/>
         </w:rPr>
-        <w:t xml:space="preserve">Evaluar una </w:t>
-      </w:r>
-      <w:proofErr w:type="spellStart"/>
-      <w:r>
-        <w:rPr>
-          <w:rFonts w:eastAsia="Times New Roman"/>
-          <w:color w:val="000000"/>
-          <w:sz w:val="24"/>
-          <w:szCs w:val="24"/>
-        </w:rPr>
-        <w:t>expresion</w:t>
-      </w:r>
-      <w:proofErr w:type="spellEnd"/>
-      <w:r>
-        <w:rPr>
-          <w:rFonts w:eastAsia="Times New Roman"/>
-          <w:color w:val="000000"/>
-          <w:sz w:val="24"/>
-          <w:szCs w:val="24"/>
-        </w:rPr>
-        <w:t xml:space="preserve"> algebraica</w:t>
+        <w:t>Reduce</w:t>
+      </w:r>
+      <w:r>
+        <w:rPr>
+          <w:rFonts w:eastAsia="Times New Roman"/>
+          <w:color w:val="000000"/>
+          <w:sz w:val="24"/>
+          <w:szCs w:val="24"/>
+        </w:rPr>
+        <w:t>: 2a</w:t>
+      </w:r>
+      <w:r>
+        <w:rPr>
+          <w:rFonts w:eastAsia="Times New Roman"/>
+          <w:color w:val="000000"/>
+          <w:sz w:val="24"/>
+          <w:szCs w:val="24"/>
+          <w:vertAlign w:val="superscript"/>
+        </w:rPr>
+        <w:t>2</w:t>
+      </w:r>
+      <w:r>
+        <w:rPr>
+          <w:rFonts w:eastAsia="Times New Roman"/>
+          <w:color w:val="000000"/>
+          <w:sz w:val="24"/>
+          <w:szCs w:val="24"/>
+        </w:rPr>
+        <w:t xml:space="preserve"> – a - 5a</w:t>
+      </w:r>
+      <w:r>
+        <w:rPr>
+          <w:rFonts w:eastAsia="Times New Roman"/>
+          <w:color w:val="000000"/>
+          <w:sz w:val="24"/>
+          <w:szCs w:val="24"/>
+          <w:vertAlign w:val="superscript"/>
+        </w:rPr>
+        <w:t>2</w:t>
+      </w:r>
+      <w:r>
+        <w:rPr>
+          <w:rFonts w:eastAsia="Times New Roman"/>
+          <w:color w:val="000000"/>
+          <w:sz w:val="24"/>
+          <w:szCs w:val="24"/>
+        </w:rPr>
+        <w:t xml:space="preserve"> + 4a - 2</w:t>
       </w:r>
     </w:p>
     <w:p>
@@ -2066,25 +3693,42 @@
           <w:szCs w:val="24"/>
         </w:rPr>
       </w:pPr>
-      <w:proofErr w:type="spellStart"/>
-      <w:r>
-        <w:rPr>
-          <w:rFonts w:eastAsia="Times New Roman"/>
-          <w:color w:val="000000"/>
-          <w:sz w:val="24"/>
-          <w:szCs w:val="24"/>
-        </w:rPr>
-        <w:t>Ops</w:t>
-      </w:r>
-      <w:proofErr w:type="spellEnd"/>
-      <w:r>
-        <w:rPr>
-          <w:rFonts w:eastAsia="Times New Roman"/>
-          <w:color w:val="000000"/>
-          <w:sz w:val="24"/>
-          <w:szCs w:val="24"/>
-        </w:rPr>
-        <w:t xml:space="preserve"> combis con monomios</w:t>
+      <w:r>
+        <w:rPr>
+          <w:rFonts w:eastAsia="Times New Roman"/>
+          <w:color w:val="000000"/>
+          <w:sz w:val="24"/>
+          <w:szCs w:val="24"/>
+        </w:rPr>
+        <w:t>Amplía</w:t>
+      </w:r>
+      <w:r>
+        <w:rPr>
+          <w:rFonts w:eastAsia="Times New Roman"/>
+          <w:color w:val="000000"/>
+          <w:sz w:val="24"/>
+          <w:szCs w:val="24"/>
+        </w:rPr>
+        <w:t>: 3x</w:t>
+      </w:r>
+      <w:r>
+        <w:rPr>
+          <w:rFonts w:eastAsia="Times New Roman"/>
+          <w:color w:val="000000"/>
+          <w:sz w:val="24"/>
+          <w:szCs w:val="24"/>
+          <w:vertAlign w:val="superscript"/>
+        </w:rPr>
+        <w:t>2</w:t>
+      </w:r>
+      <w:r>
+        <w:rPr>
+          <w:rFonts w:eastAsia="Times New Roman"/>
+          <w:color w:val="000000"/>
+          <w:sz w:val="24"/>
+          <w:szCs w:val="24"/>
+        </w:rPr>
+        <w:t xml:space="preserve"> (2x – y + 10z)</w:t>
       </w:r>
     </w:p>
     <w:p>
@@ -2108,31 +3752,38 @@
           <w:szCs w:val="24"/>
         </w:rPr>
       </w:pPr>
-      <w:proofErr w:type="spellStart"/>
-      <w:r>
-        <w:rPr>
-          <w:rFonts w:eastAsia="Times New Roman"/>
-          <w:color w:val="000000"/>
-          <w:sz w:val="24"/>
-          <w:szCs w:val="24"/>
-        </w:rPr>
-        <w:t>Ecs</w:t>
-      </w:r>
-      <w:proofErr w:type="spellEnd"/>
-      <w:r>
-        <w:rPr>
-          <w:rFonts w:eastAsia="Times New Roman"/>
-          <w:color w:val="000000"/>
-          <w:sz w:val="24"/>
-          <w:szCs w:val="24"/>
-        </w:rPr>
-        <w:t xml:space="preserve"> de primer grado</w:t>
+      <w:r>
+        <w:rPr>
+          <w:rFonts w:eastAsia="Times New Roman"/>
+          <w:color w:val="000000"/>
+          <w:sz w:val="24"/>
+          <w:szCs w:val="24"/>
+        </w:rPr>
+        <w:t>Opera</w:t>
+      </w:r>
+      <w:r>
+        <w:rPr>
+          <w:rFonts w:eastAsia="Times New Roman"/>
+          <w:color w:val="000000"/>
+          <w:sz w:val="24"/>
+          <w:szCs w:val="24"/>
+        </w:rPr>
+        <w:t xml:space="preserve"> y simplifica</w:t>
+      </w:r>
+      <w:r>
+        <w:rPr>
+          <w:rFonts w:eastAsia="Times New Roman"/>
+          <w:color w:val="000000"/>
+          <w:sz w:val="24"/>
+          <w:szCs w:val="24"/>
+        </w:rPr>
+        <w:t>:</w:t>
       </w:r>
     </w:p>
     <w:p>
       <w:pPr>
         <w:numPr>
-          <w:ilvl w:val="1"/>
+          <w:ilvl w:val="2"/>
           <w:numId w:val="4"/>
         </w:numPr>
         <w:pBdr>
@@ -2150,10 +3801,381 @@
           <w:szCs w:val="24"/>
         </w:rPr>
       </w:pPr>
+      <w:r>
+        <w:rPr>
+          <w:rFonts w:eastAsia="Times New Roman"/>
+          <w:color w:val="000000"/>
+          <w:sz w:val="24"/>
+          <w:szCs w:val="24"/>
+        </w:rPr>
+        <w:t>-10</w:t>
+      </w:r>
+      <w:proofErr w:type="gramStart"/>
+      <w:r>
+        <w:rPr>
+          <w:rFonts w:eastAsia="Times New Roman"/>
+          <w:color w:val="000000"/>
+          <w:sz w:val="24"/>
+          <w:szCs w:val="24"/>
+        </w:rPr>
+        <w:t>x :</w:t>
+      </w:r>
+      <w:proofErr w:type="gramEnd"/>
+      <w:r>
+        <w:rPr>
+          <w:rFonts w:eastAsia="Times New Roman"/>
+          <w:color w:val="000000"/>
+          <w:sz w:val="24"/>
+          <w:szCs w:val="24"/>
+        </w:rPr>
+        <w:t xml:space="preserve"> 5x</w:t>
+      </w:r>
+      <w:r>
+        <w:rPr>
+          <w:rFonts w:eastAsia="Times New Roman"/>
+          <w:color w:val="000000"/>
+          <w:sz w:val="24"/>
+          <w:szCs w:val="24"/>
+          <w:vertAlign w:val="superscript"/>
+        </w:rPr>
+        <w:t>2</w:t>
+      </w:r>
+    </w:p>
+    <w:p>
+      <w:pPr>
+        <w:numPr>
+          <w:ilvl w:val="2"/>
+          <w:numId w:val="4"/>
+        </w:numPr>
+        <w:pBdr>
+          <w:top w:val="nil"/>
+          <w:left w:val="nil"/>
+          <w:bottom w:val="nil"/>
+          <w:right w:val="nil"/>
+          <w:between w:val="nil"/>
+        </w:pBdr>
+        <w:spacing w:after="0" w:line="360" w:lineRule="auto"/>
+        <w:rPr>
+          <w:rFonts w:eastAsia="Times New Roman"/>
+          <w:color w:val="000000"/>
+          <w:sz w:val="24"/>
+          <w:szCs w:val="24"/>
+        </w:rPr>
+      </w:pPr>
+      <w:r>
+        <w:rPr>
+          <w:rFonts w:eastAsia="Times New Roman"/>
+          <w:color w:val="000000"/>
+          <w:sz w:val="24"/>
+          <w:szCs w:val="24"/>
+        </w:rPr>
+        <w:t>3a</w:t>
+      </w:r>
+      <w:r>
+        <w:rPr>
+          <w:rFonts w:eastAsia="Times New Roman"/>
+          <w:color w:val="000000"/>
+          <w:sz w:val="24"/>
+          <w:szCs w:val="24"/>
+          <w:vertAlign w:val="superscript"/>
+        </w:rPr>
+        <w:t>3</w:t>
+      </w:r>
+      <w:r>
+        <w:rPr>
+          <w:rFonts w:eastAsia="Times New Roman"/>
+          <w:color w:val="000000"/>
+          <w:sz w:val="24"/>
+          <w:szCs w:val="24"/>
+        </w:rPr>
+        <w:t>b</w:t>
+      </w:r>
+      <w:r>
+        <w:rPr>
+          <w:rFonts w:eastAsia="Times New Roman"/>
+          <w:color w:val="000000"/>
+          <w:sz w:val="24"/>
+          <w:szCs w:val="24"/>
+          <w:vertAlign w:val="superscript"/>
+        </w:rPr>
+        <w:t>2</w:t>
+      </w:r>
+      <w:r>
+        <w:rPr>
+          <w:rFonts w:eastAsia="Times New Roman"/>
+          <w:color w:val="000000"/>
+          <w:sz w:val="24"/>
+          <w:szCs w:val="24"/>
+        </w:rPr>
+        <w:t xml:space="preserve"> </w:t>
+      </w:r>
+      <w:r>
+        <w:rPr>
+          <w:rFonts w:ascii="Cambria Math" w:eastAsia="Times New Roman" w:hAnsi="Cambria Math" w:cs="Cambria Math"/>
+          <w:color w:val="000000"/>
+          <w:sz w:val="24"/>
+          <w:szCs w:val="24"/>
+        </w:rPr>
+        <w:t>⋅</w:t>
+      </w:r>
+      <w:r>
+        <w:rPr>
+          <w:rFonts w:ascii="Cambria Math" w:eastAsia="Times New Roman" w:hAnsi="Cambria Math" w:cs="Cambria Math"/>
+          <w:color w:val="000000"/>
+          <w:sz w:val="24"/>
+          <w:szCs w:val="24"/>
+        </w:rPr>
+        <w:t xml:space="preserve"> 6bc</w:t>
+      </w:r>
+      <w:r>
+        <w:rPr>
+          <w:rFonts w:ascii="Cambria Math" w:eastAsia="Times New Roman" w:hAnsi="Cambria Math" w:cs="Cambria Math"/>
+          <w:color w:val="000000"/>
+          <w:sz w:val="24"/>
+          <w:szCs w:val="24"/>
+          <w:vertAlign w:val="superscript"/>
+        </w:rPr>
+        <w:t>5</w:t>
+      </w:r>
+    </w:p>
+    <w:p>
+      <w:pPr>
+        <w:pBdr>
+          <w:top w:val="nil"/>
+          <w:left w:val="nil"/>
+          <w:bottom w:val="nil"/>
+          <w:right w:val="nil"/>
+          <w:between w:val="nil"/>
+        </w:pBdr>
+        <w:spacing w:after="0" w:line="360" w:lineRule="auto"/>
+        <w:ind w:left="708"/>
+        <w:rPr>
+          <w:rFonts w:eastAsia="Times New Roman"/>
+          <w:color w:val="000000"/>
+          <w:sz w:val="24"/>
+          <w:szCs w:val="24"/>
+        </w:rPr>
+      </w:pPr>
+    </w:p>
+    <w:p>
+      <w:pPr>
+        <w:numPr>
+          <w:ilvl w:val="0"/>
+          <w:numId w:val="4"/>
+        </w:numPr>
+        <w:pBdr>
+          <w:top w:val="nil"/>
+          <w:left w:val="nil"/>
+          <w:bottom w:val="nil"/>
+          <w:right w:val="nil"/>
+          <w:between w:val="nil"/>
+        </w:pBdr>
+        <w:spacing w:after="0" w:line="360" w:lineRule="auto"/>
+        <w:rPr>
+          <w:rFonts w:eastAsia="Times New Roman"/>
+          <w:color w:val="000000"/>
+          <w:sz w:val="24"/>
+          <w:szCs w:val="24"/>
+        </w:rPr>
+      </w:pPr>
+      <w:r>
+        <w:rPr>
+          <w:rFonts w:eastAsia="Times New Roman"/>
+          <w:b/>
+          <w:bCs/>
+          <w:i/>
+          <w:iCs/>
+          <w:color w:val="000000"/>
+          <w:sz w:val="24"/>
+          <w:szCs w:val="24"/>
+        </w:rPr>
+        <w:t>[</w:t>
+      </w:r>
+      <w:r>
+        <w:rPr>
+          <w:rFonts w:eastAsia="Times New Roman"/>
+          <w:b/>
+          <w:bCs/>
+          <w:i/>
+          <w:iCs/>
+          <w:color w:val="000000"/>
+          <w:sz w:val="24"/>
+          <w:szCs w:val="24"/>
+        </w:rPr>
+        <w:t>1</w:t>
+      </w:r>
+      <w:r>
+        <w:rPr>
+          <w:rFonts w:eastAsia="Times New Roman"/>
+          <w:b/>
+          <w:bCs/>
+          <w:i/>
+          <w:iCs/>
+          <w:color w:val="000000"/>
+          <w:sz w:val="24"/>
+          <w:szCs w:val="24"/>
+        </w:rPr>
+        <w:t xml:space="preserve"> </w:t>
+      </w:r>
       <w:proofErr w:type="spellStart"/>
       <w:r>
         <w:rPr>
           <w:rFonts w:eastAsia="Times New Roman"/>
+          <w:b/>
+          <w:bCs/>
+          <w:i/>
+          <w:iCs/>
+          <w:color w:val="000000"/>
+          <w:sz w:val="24"/>
+          <w:szCs w:val="24"/>
+        </w:rPr>
+        <w:t>pts</w:t>
+      </w:r>
+      <w:proofErr w:type="spellEnd"/>
+      <w:r>
+        <w:rPr>
+          <w:rFonts w:eastAsia="Times New Roman"/>
+          <w:b/>
+          <w:bCs/>
+          <w:i/>
+          <w:iCs/>
+          <w:color w:val="000000"/>
+          <w:sz w:val="24"/>
+          <w:szCs w:val="24"/>
+        </w:rPr>
+        <w:t>]</w:t>
+      </w:r>
+      <w:r>
+        <w:rPr>
+          <w:rFonts w:eastAsia="Times New Roman"/>
+          <w:color w:val="000000"/>
+          <w:sz w:val="24"/>
+          <w:szCs w:val="24"/>
+        </w:rPr>
+        <w:t xml:space="preserve"> </w:t>
+      </w:r>
+      <w:proofErr w:type="spellStart"/>
+      <w:r>
+        <w:rPr>
+          <w:rFonts w:eastAsia="Times New Roman"/>
+          <w:color w:val="000000"/>
+          <w:sz w:val="24"/>
+          <w:szCs w:val="24"/>
+        </w:rPr>
+        <w:t>Ecs</w:t>
+      </w:r>
+      <w:proofErr w:type="spellEnd"/>
+      <w:r>
+        <w:rPr>
+          <w:rFonts w:eastAsia="Times New Roman"/>
+          <w:color w:val="000000"/>
+          <w:sz w:val="24"/>
+          <w:szCs w:val="24"/>
+        </w:rPr>
+        <w:t xml:space="preserve"> de primer grado</w:t>
+      </w:r>
+    </w:p>
+    <w:p>
+      <w:pPr>
+        <w:numPr>
+          <w:ilvl w:val="0"/>
+          <w:numId w:val="4"/>
+        </w:numPr>
+        <w:pBdr>
+          <w:top w:val="nil"/>
+          <w:left w:val="nil"/>
+          <w:bottom w:val="nil"/>
+          <w:right w:val="nil"/>
+          <w:between w:val="nil"/>
+        </w:pBdr>
+        <w:spacing w:after="0" w:line="360" w:lineRule="auto"/>
+        <w:rPr>
+          <w:rFonts w:eastAsia="Times New Roman"/>
+          <w:color w:val="000000"/>
+          <w:sz w:val="24"/>
+          <w:szCs w:val="24"/>
+        </w:rPr>
+      </w:pPr>
+      <w:r>
+        <w:rPr>
+          <w:rFonts w:eastAsia="Times New Roman"/>
+          <w:b/>
+          <w:bCs/>
+          <w:i/>
+          <w:iCs/>
+          <w:color w:val="000000"/>
+          <w:sz w:val="24"/>
+          <w:szCs w:val="24"/>
+        </w:rPr>
+        <w:t>[</w:t>
+      </w:r>
+      <w:r>
+        <w:rPr>
+          <w:rFonts w:eastAsia="Times New Roman"/>
+          <w:b/>
+          <w:bCs/>
+          <w:i/>
+          <w:iCs/>
+          <w:color w:val="000000"/>
+          <w:sz w:val="24"/>
+          <w:szCs w:val="24"/>
+        </w:rPr>
+        <w:t>2</w:t>
+      </w:r>
+      <w:r>
+        <w:rPr>
+          <w:rFonts w:eastAsia="Times New Roman"/>
+          <w:b/>
+          <w:bCs/>
+          <w:i/>
+          <w:iCs/>
+          <w:color w:val="000000"/>
+          <w:sz w:val="24"/>
+          <w:szCs w:val="24"/>
+        </w:rPr>
+        <w:t xml:space="preserve"> </w:t>
+      </w:r>
+      <w:proofErr w:type="spellStart"/>
+      <w:r>
+        <w:rPr>
+          <w:rFonts w:eastAsia="Times New Roman"/>
+          <w:b/>
+          <w:bCs/>
+          <w:i/>
+          <w:iCs/>
+          <w:color w:val="000000"/>
+          <w:sz w:val="24"/>
+          <w:szCs w:val="24"/>
+        </w:rPr>
+        <w:t>pts</w:t>
+      </w:r>
+      <w:proofErr w:type="spellEnd"/>
+      <w:r>
+        <w:rPr>
+          <w:rFonts w:eastAsia="Times New Roman"/>
+          <w:b/>
+          <w:bCs/>
+          <w:i/>
+          <w:iCs/>
+          <w:color w:val="000000"/>
+          <w:sz w:val="24"/>
+          <w:szCs w:val="24"/>
+        </w:rPr>
+        <w:t>]</w:t>
+      </w:r>
+      <w:r>
+        <w:rPr>
+          <w:rFonts w:eastAsia="Times New Roman"/>
+          <w:color w:val="000000"/>
+          <w:sz w:val="24"/>
+          <w:szCs w:val="24"/>
+        </w:rPr>
+        <w:t xml:space="preserve"> </w:t>
+      </w:r>
+      <w:proofErr w:type="spellStart"/>
+      <w:r>
+        <w:rPr>
+          <w:rFonts w:eastAsia="Times New Roman"/>
           <w:color w:val="000000"/>
           <w:sz w:val="24"/>
           <w:szCs w:val="24"/>
@@ -2168,7 +4190,27 @@
           <w:sz w:val="24"/>
           <w:szCs w:val="24"/>
         </w:rPr>
-        <w:t xml:space="preserve"> ecs primer grado</w:t>
+        <w:t xml:space="preserve"> </w:t>
+      </w:r>
+      <w:proofErr w:type="spellStart"/>
+      <w:r>
+        <w:rPr>
+          <w:rFonts w:eastAsia="Times New Roman"/>
+          <w:color w:val="000000"/>
+          <w:sz w:val="24"/>
+          <w:szCs w:val="24"/>
+        </w:rPr>
+        <w:t>ecs</w:t>
+      </w:r>
+      <w:proofErr w:type="spellEnd"/>
+      <w:r>
+        <w:rPr>
+          <w:rFonts w:eastAsia="Times New Roman"/>
+          <w:color w:val="000000"/>
+          <w:sz w:val="24"/>
+          <w:szCs w:val="24"/>
+        </w:rPr>
+        <w:t xml:space="preserve"> primer grado</w:t>
       </w:r>
     </w:p>
     <w:p>

</xml_diff>